<commit_message>
feat(ajout de bcrypt dans authController)
[15][Done]
</commit_message>
<xml_diff>
--- a/Doc/Rapport_P_183_Secured_webshop_Camille_CID2A.docx
+++ b/Doc/Rapport_P_183_Secured_webshop_Camille_CID2A.docx
@@ -95,6 +95,7 @@
                         <w:szCs w:val="88"/>
                       </w:rPr>
                     </w:pPr>
+                    <w:proofErr w:type="spellStart"/>
                     <w:r>
                       <w:rPr>
                         <w:rFonts w:asciiTheme="majorHAnsi" w:eastAsiaTheme="majorEastAsia" w:hAnsiTheme="majorHAnsi" w:cstheme="majorBidi"/>
@@ -102,7 +103,17 @@
                         <w:sz w:val="88"/>
                         <w:szCs w:val="88"/>
                       </w:rPr>
-                      <w:t>Projet p_</w:t>
+                      <w:t>Projet</w:t>
+                    </w:r>
+                    <w:proofErr w:type="spellEnd"/>
+                    <w:r>
+                      <w:rPr>
+                        <w:rFonts w:asciiTheme="majorHAnsi" w:eastAsiaTheme="majorEastAsia" w:hAnsiTheme="majorHAnsi" w:cstheme="majorBidi"/>
+                        <w:color w:val="4F81BD" w:themeColor="accent1"/>
+                        <w:sz w:val="88"/>
+                        <w:szCs w:val="88"/>
+                      </w:rPr>
+                      <w:t xml:space="preserve"> p_</w:t>
                     </w:r>
                     <w:r>
                       <w:rPr>
@@ -159,8 +170,18 @@
                         <w:sz w:val="24"/>
                         <w:szCs w:val="24"/>
                       </w:rPr>
-                      <w:t>Secured Webshop</w:t>
+                      <w:t xml:space="preserve">Secured </w:t>
                     </w:r>
+                    <w:proofErr w:type="spellStart"/>
+                    <w:r>
+                      <w:rPr>
+                        <w:color w:val="365F91" w:themeColor="accent1" w:themeShade="BF"/>
+                        <w:sz w:val="24"/>
+                        <w:szCs w:val="24"/>
+                      </w:rPr>
+                      <w:t>Webshop</w:t>
+                    </w:r>
+                    <w:proofErr w:type="spellEnd"/>
                   </w:p>
                 </w:tc>
               </w:sdtContent>
@@ -1675,7 +1696,29 @@
             <w:szCs w:val="24"/>
             <w:lang w:val="fr-CH"/>
           </w:rPr>
-          <w:t>Authentification avec ExpressJS - Créer un Système de Connexion pour Débutants</w:t>
+          <w:t xml:space="preserve">Authentification avec </w:t>
+        </w:r>
+        <w:proofErr w:type="spellStart"/>
+        <w:r>
+          <w:rPr>
+            <w:rStyle w:val="Lienhypertexte"/>
+            <w:rFonts w:asciiTheme="majorHAnsi" w:hAnsiTheme="majorHAnsi" w:cstheme="majorHAnsi"/>
+            <w:sz w:val="24"/>
+            <w:szCs w:val="24"/>
+            <w:lang w:val="fr-CH"/>
+          </w:rPr>
+          <w:t>ExpressJS</w:t>
+        </w:r>
+        <w:proofErr w:type="spellEnd"/>
+        <w:r>
+          <w:rPr>
+            <w:rStyle w:val="Lienhypertexte"/>
+            <w:rFonts w:asciiTheme="majorHAnsi" w:hAnsiTheme="majorHAnsi" w:cstheme="majorHAnsi"/>
+            <w:sz w:val="24"/>
+            <w:szCs w:val="24"/>
+            <w:lang w:val="fr-CH"/>
+          </w:rPr>
+          <w:t xml:space="preserve"> - Créer un Système de Connexion pour Débutants</w:t>
         </w:r>
       </w:hyperlink>
     </w:p>
@@ -1758,6 +1801,342 @@
           <w:lang w:val="fr-CH"/>
         </w:rPr>
       </w:pPr>
+      <w:r>
+        <w:rPr>
+          <w:rFonts w:asciiTheme="majorHAnsi" w:hAnsiTheme="majorHAnsi" w:cstheme="majorHAnsi"/>
+          <w:sz w:val="24"/>
+          <w:szCs w:val="24"/>
+          <w:lang w:val="fr-CH"/>
+        </w:rPr>
+        <w:t>Dans ton terminal, à la racine du projet :</w:t>
+      </w:r>
+    </w:p>
+    <w:p>
+      <w:pPr>
+        <w:spacing w:before="0" w:after="0" w:line="240" w:lineRule="auto"/>
+        <w:jc w:val="both"/>
+        <w:rPr>
+          <w:rFonts w:asciiTheme="majorHAnsi" w:hAnsiTheme="majorHAnsi" w:cstheme="majorHAnsi"/>
+          <w:sz w:val="24"/>
+          <w:szCs w:val="24"/>
+          <w:lang w:val="fr-CH"/>
+        </w:rPr>
+      </w:pPr>
+      <w:proofErr w:type="spellStart"/>
+      <w:r>
+        <w:rPr>
+          <w:rFonts w:asciiTheme="majorHAnsi" w:hAnsiTheme="majorHAnsi" w:cstheme="majorHAnsi"/>
+          <w:sz w:val="24"/>
+          <w:szCs w:val="24"/>
+          <w:lang w:val="fr-CH"/>
+        </w:rPr>
+        <w:t>Npm</w:t>
+      </w:r>
+      <w:proofErr w:type="spellEnd"/>
+      <w:r>
+        <w:rPr>
+          <w:rFonts w:asciiTheme="majorHAnsi" w:hAnsiTheme="majorHAnsi" w:cstheme="majorHAnsi"/>
+          <w:sz w:val="24"/>
+          <w:szCs w:val="24"/>
+          <w:lang w:val="fr-CH"/>
+        </w:rPr>
+        <w:t xml:space="preserve"> </w:t>
+      </w:r>
+      <w:proofErr w:type="spellStart"/>
+      <w:r>
+        <w:rPr>
+          <w:rFonts w:asciiTheme="majorHAnsi" w:hAnsiTheme="majorHAnsi" w:cstheme="majorHAnsi"/>
+          <w:sz w:val="24"/>
+          <w:szCs w:val="24"/>
+          <w:lang w:val="fr-CH"/>
+        </w:rPr>
+        <w:t>install</w:t>
+      </w:r>
+      <w:proofErr w:type="spellEnd"/>
+      <w:r>
+        <w:rPr>
+          <w:rFonts w:asciiTheme="majorHAnsi" w:hAnsiTheme="majorHAnsi" w:cstheme="majorHAnsi"/>
+          <w:sz w:val="24"/>
+          <w:szCs w:val="24"/>
+          <w:lang w:val="fr-CH"/>
+        </w:rPr>
+        <w:t xml:space="preserve"> </w:t>
+      </w:r>
+      <w:proofErr w:type="spellStart"/>
+      <w:r>
+        <w:rPr>
+          <w:rFonts w:asciiTheme="majorHAnsi" w:hAnsiTheme="majorHAnsi" w:cstheme="majorHAnsi"/>
+          <w:sz w:val="24"/>
+          <w:szCs w:val="24"/>
+          <w:lang w:val="fr-CH"/>
+        </w:rPr>
+        <w:t>bcrypt</w:t>
+      </w:r>
+      <w:proofErr w:type="spellEnd"/>
+    </w:p>
+    <w:p>
+      <w:pPr>
+        <w:spacing w:before="0" w:after="0" w:line="240" w:lineRule="auto"/>
+        <w:jc w:val="both"/>
+        <w:rPr>
+          <w:rFonts w:asciiTheme="majorHAnsi" w:hAnsiTheme="majorHAnsi" w:cstheme="majorHAnsi"/>
+          <w:sz w:val="24"/>
+          <w:szCs w:val="24"/>
+          <w:lang w:val="fr-CH"/>
+        </w:rPr>
+      </w:pPr>
+    </w:p>
+    <w:p>
+      <w:pPr>
+        <w:spacing w:before="0" w:after="0" w:line="240" w:lineRule="auto"/>
+        <w:jc w:val="both"/>
+        <w:rPr>
+          <w:rFonts w:asciiTheme="majorHAnsi" w:hAnsiTheme="majorHAnsi" w:cstheme="majorHAnsi"/>
+          <w:sz w:val="24"/>
+          <w:szCs w:val="24"/>
+          <w:lang w:val="fr-CH"/>
+        </w:rPr>
+      </w:pPr>
+      <w:r>
+        <w:rPr>
+          <w:rFonts w:asciiTheme="majorHAnsi" w:hAnsiTheme="majorHAnsi" w:cstheme="majorHAnsi"/>
+          <w:sz w:val="24"/>
+          <w:szCs w:val="24"/>
+          <w:lang w:val="fr-CH"/>
+        </w:rPr>
+        <w:t xml:space="preserve">Créer un fichier </w:t>
+      </w:r>
+      <w:proofErr w:type="spellStart"/>
+      <w:r>
+        <w:rPr>
+          <w:rFonts w:asciiTheme="majorHAnsi" w:hAnsiTheme="majorHAnsi" w:cstheme="majorHAnsi"/>
+          <w:sz w:val="24"/>
+          <w:szCs w:val="24"/>
+          <w:lang w:val="fr-CH"/>
+        </w:rPr>
+        <w:t>init.sql</w:t>
+      </w:r>
+      <w:proofErr w:type="spellEnd"/>
+      <w:r>
+        <w:rPr>
+          <w:rFonts w:asciiTheme="majorHAnsi" w:hAnsiTheme="majorHAnsi" w:cstheme="majorHAnsi"/>
+          <w:sz w:val="24"/>
+          <w:szCs w:val="24"/>
+          <w:lang w:val="fr-CH"/>
+        </w:rPr>
+        <w:t xml:space="preserve"> pour générer le hash car on a besoin de </w:t>
+      </w:r>
+      <w:proofErr w:type="spellStart"/>
+      <w:r>
+        <w:rPr>
+          <w:rFonts w:asciiTheme="majorHAnsi" w:hAnsiTheme="majorHAnsi" w:cstheme="majorHAnsi"/>
+          <w:sz w:val="24"/>
+          <w:szCs w:val="24"/>
+          <w:lang w:val="fr-CH"/>
+        </w:rPr>
+        <w:t>hasher</w:t>
+      </w:r>
+      <w:proofErr w:type="spellEnd"/>
+      <w:r>
+        <w:rPr>
+          <w:rFonts w:asciiTheme="majorHAnsi" w:hAnsiTheme="majorHAnsi" w:cstheme="majorHAnsi"/>
+          <w:sz w:val="24"/>
+          <w:szCs w:val="24"/>
+          <w:lang w:val="fr-CH"/>
+        </w:rPr>
+        <w:t xml:space="preserve"> le mot de passe existant.</w:t>
+      </w:r>
+    </w:p>
+    <w:p>
+      <w:pPr>
+        <w:spacing w:before="0" w:after="0" w:line="240" w:lineRule="auto"/>
+        <w:jc w:val="both"/>
+        <w:rPr>
+          <w:rFonts w:asciiTheme="majorHAnsi" w:hAnsiTheme="majorHAnsi" w:cstheme="majorHAnsi"/>
+          <w:sz w:val="24"/>
+          <w:szCs w:val="24"/>
+          <w:lang w:val="fr-CH"/>
+        </w:rPr>
+      </w:pPr>
+      <w:r>
+        <w:rPr>
+          <w:rFonts w:asciiTheme="majorHAnsi" w:hAnsiTheme="majorHAnsi" w:cstheme="majorHAnsi"/>
+          <w:sz w:val="24"/>
+          <w:szCs w:val="24"/>
+          <w:lang w:val="fr-CH"/>
+        </w:rPr>
+        <w:t>Lancer le fichier à la racine avec :</w:t>
+      </w:r>
+    </w:p>
+    <w:p>
+      <w:pPr>
+        <w:spacing w:before="0" w:after="0" w:line="240" w:lineRule="auto"/>
+        <w:jc w:val="both"/>
+        <w:rPr>
+          <w:rFonts w:asciiTheme="majorHAnsi" w:hAnsiTheme="majorHAnsi" w:cstheme="majorHAnsi"/>
+          <w:sz w:val="24"/>
+          <w:szCs w:val="24"/>
+          <w:lang w:val="fr-CH"/>
+        </w:rPr>
+      </w:pPr>
+      <w:r>
+        <w:rPr>
+          <w:rFonts w:asciiTheme="majorHAnsi" w:hAnsiTheme="majorHAnsi" w:cstheme="majorHAnsi"/>
+          <w:sz w:val="24"/>
+          <w:szCs w:val="24"/>
+          <w:lang w:val="fr-CH"/>
+        </w:rPr>
+        <w:t>Node generate-hash.js</w:t>
+      </w:r>
+    </w:p>
+    <w:p>
+      <w:pPr>
+        <w:spacing w:before="0" w:after="0" w:line="240" w:lineRule="auto"/>
+        <w:jc w:val="both"/>
+        <w:rPr>
+          <w:rFonts w:asciiTheme="majorHAnsi" w:hAnsiTheme="majorHAnsi" w:cstheme="majorHAnsi"/>
+          <w:sz w:val="24"/>
+          <w:szCs w:val="24"/>
+          <w:lang w:val="fr-CH"/>
+        </w:rPr>
+      </w:pPr>
+    </w:p>
+    <w:p>
+      <w:pPr>
+        <w:spacing w:before="0" w:after="0" w:line="240" w:lineRule="auto"/>
+        <w:jc w:val="both"/>
+        <w:rPr>
+          <w:rFonts w:asciiTheme="majorHAnsi" w:hAnsiTheme="majorHAnsi" w:cstheme="majorHAnsi"/>
+          <w:sz w:val="24"/>
+          <w:szCs w:val="24"/>
+          <w:lang w:val="fr-CH"/>
+        </w:rPr>
+      </w:pPr>
+      <w:r>
+        <w:rPr>
+          <w:rFonts w:asciiTheme="majorHAnsi" w:hAnsiTheme="majorHAnsi" w:cstheme="majorHAnsi"/>
+          <w:sz w:val="24"/>
+          <w:szCs w:val="24"/>
+          <w:lang w:val="fr-CH"/>
+        </w:rPr>
+        <w:t xml:space="preserve">Mettre le hash dans </w:t>
+      </w:r>
+      <w:proofErr w:type="spellStart"/>
+      <w:r>
+        <w:rPr>
+          <w:rFonts w:asciiTheme="majorHAnsi" w:hAnsiTheme="majorHAnsi" w:cstheme="majorHAnsi"/>
+          <w:sz w:val="24"/>
+          <w:szCs w:val="24"/>
+          <w:lang w:val="fr-CH"/>
+        </w:rPr>
+        <w:t>init.sql</w:t>
+      </w:r>
+      <w:proofErr w:type="spellEnd"/>
+      <w:r>
+        <w:rPr>
+          <w:rFonts w:asciiTheme="majorHAnsi" w:hAnsiTheme="majorHAnsi" w:cstheme="majorHAnsi"/>
+          <w:sz w:val="24"/>
+          <w:szCs w:val="24"/>
+          <w:lang w:val="fr-CH"/>
+        </w:rPr>
+        <w:t>, remplacer le mot de passe en claire par le hash généré.</w:t>
+      </w:r>
+    </w:p>
+    <w:p>
+      <w:pPr>
+        <w:spacing w:before="0" w:after="0" w:line="240" w:lineRule="auto"/>
+        <w:jc w:val="both"/>
+        <w:rPr>
+          <w:rFonts w:asciiTheme="majorHAnsi" w:hAnsiTheme="majorHAnsi" w:cstheme="majorHAnsi"/>
+          <w:sz w:val="24"/>
+          <w:szCs w:val="24"/>
+          <w:lang w:val="fr-CH"/>
+        </w:rPr>
+      </w:pPr>
+    </w:p>
+    <w:p>
+      <w:pPr>
+        <w:spacing w:before="0" w:after="0" w:line="240" w:lineRule="auto"/>
+        <w:jc w:val="both"/>
+        <w:rPr>
+          <w:rFonts w:asciiTheme="majorHAnsi" w:hAnsiTheme="majorHAnsi" w:cstheme="majorHAnsi"/>
+          <w:sz w:val="24"/>
+          <w:szCs w:val="24"/>
+          <w:lang w:val="fr-CH"/>
+        </w:rPr>
+      </w:pPr>
+      <w:r>
+        <w:rPr>
+          <w:rFonts w:asciiTheme="majorHAnsi" w:hAnsiTheme="majorHAnsi" w:cstheme="majorHAnsi"/>
+          <w:sz w:val="24"/>
+          <w:szCs w:val="24"/>
+          <w:lang w:val="fr-CH"/>
+        </w:rPr>
+        <w:t>Modifier AuthController.js</w:t>
+      </w:r>
+    </w:p>
+    <w:p>
+      <w:pPr>
+        <w:spacing w:before="0" w:after="0" w:line="240" w:lineRule="auto"/>
+        <w:jc w:val="both"/>
+        <w:rPr>
+          <w:rFonts w:asciiTheme="majorHAnsi" w:hAnsiTheme="majorHAnsi" w:cstheme="majorHAnsi"/>
+          <w:sz w:val="24"/>
+          <w:szCs w:val="24"/>
+          <w:lang w:val="fr-CH"/>
+        </w:rPr>
+      </w:pPr>
+      <w:r>
+        <w:rPr>
+          <w:rFonts w:asciiTheme="majorHAnsi" w:hAnsiTheme="majorHAnsi" w:cstheme="majorHAnsi"/>
+          <w:sz w:val="24"/>
+          <w:szCs w:val="24"/>
+          <w:lang w:val="fr-CH"/>
+        </w:rPr>
+        <w:t xml:space="preserve">Dans la </w:t>
+      </w:r>
+      <w:proofErr w:type="spellStart"/>
+      <w:r>
+        <w:rPr>
+          <w:rFonts w:asciiTheme="majorHAnsi" w:hAnsiTheme="majorHAnsi" w:cstheme="majorHAnsi"/>
+          <w:sz w:val="24"/>
+          <w:szCs w:val="24"/>
+          <w:lang w:val="fr-CH"/>
+        </w:rPr>
+        <w:t>function</w:t>
+      </w:r>
+      <w:proofErr w:type="spellEnd"/>
+      <w:r>
+        <w:rPr>
+          <w:rFonts w:asciiTheme="majorHAnsi" w:hAnsiTheme="majorHAnsi" w:cstheme="majorHAnsi"/>
+          <w:sz w:val="24"/>
+          <w:szCs w:val="24"/>
+          <w:lang w:val="fr-CH"/>
+        </w:rPr>
+        <w:t xml:space="preserve"> login, on remplace la comparaison en claire par </w:t>
+      </w:r>
+      <w:proofErr w:type="spellStart"/>
+      <w:proofErr w:type="gramStart"/>
+      <w:r>
+        <w:rPr>
+          <w:rFonts w:asciiTheme="majorHAnsi" w:hAnsiTheme="majorHAnsi" w:cstheme="majorHAnsi"/>
+          <w:sz w:val="24"/>
+          <w:szCs w:val="24"/>
+          <w:lang w:val="fr-CH"/>
+        </w:rPr>
+        <w:t>bcrypt.compare</w:t>
+      </w:r>
+      <w:proofErr w:type="spellEnd"/>
+      <w:proofErr w:type="gramEnd"/>
+      <w:r>
+        <w:rPr>
+          <w:rFonts w:asciiTheme="majorHAnsi" w:hAnsiTheme="majorHAnsi" w:cstheme="majorHAnsi"/>
+          <w:sz w:val="24"/>
+          <w:szCs w:val="24"/>
+          <w:lang w:val="fr-CH"/>
+        </w:rPr>
+        <w:t>()</w:t>
+      </w:r>
     </w:p>
     <w:p>
       <w:pPr>
@@ -2011,6 +2390,7 @@
         <w:rPr>
           <w:lang w:val="fr-CH"/>
         </w:rPr>
+        <w:lastRenderedPageBreak/>
         <w:t>Critique constructiv</w:t>
       </w:r>
       <w:r>
@@ -2039,7 +2419,6 @@
           <w:szCs w:val="24"/>
           <w:lang w:val="fr-CH"/>
         </w:rPr>
-        <w:lastRenderedPageBreak/>
         <w:drawing>
           <wp:inline distT="0" distB="0" distL="0" distR="0" wp14:anchorId="69A5A074" wp14:editId="219426E6">
             <wp:extent cx="5486400" cy="5186680"/>
@@ -4758,7 +5137,6 @@
   <w:style w:type="character" w:default="1" w:styleId="Policepardfaut">
     <w:name w:val="Default Paragraph Font"/>
     <w:uiPriority w:val="1"/>
-    <w:semiHidden/>
     <w:unhideWhenUsed/>
   </w:style>
   <w:style w:type="table" w:default="1" w:styleId="TableauNormal">
@@ -15814,12 +16192,12 @@
   <w:rsids>
     <w:rsidRoot w:val="001964C1"/>
     <w:rsid w:val="001964C1"/>
+    <w:rsid w:val="001C2EC4"/>
     <w:rsid w:val="002B1A2E"/>
     <w:rsid w:val="00561752"/>
     <w:rsid w:val="0058509A"/>
     <w:rsid w:val="00834C60"/>
     <w:rsid w:val="009B22E2"/>
-    <w:rsid w:val="00B57280"/>
     <w:rsid w:val="00FD7D0F"/>
   </w:rsids>
   <m:mathPr>

</xml_diff>

<commit_message>
feat(installation de bcryp, cration de generate-hash à la racine, remplacement de mdp par le hash dans init.sql)
[40][Done]
</commit_message>
<xml_diff>
--- a/Doc/Rapport_P_183_Secured_webshop_Camille_CID2A.docx
+++ b/Doc/Rapport_P_183_Secured_webshop_Camille_CID2A.docx
@@ -2000,6 +2000,78 @@
           <w:lang w:val="fr-CH"/>
         </w:rPr>
       </w:pPr>
+      <w:r>
+        <w:rPr>
+          <w:rFonts w:asciiTheme="majorHAnsi" w:hAnsiTheme="majorHAnsi" w:cstheme="majorHAnsi"/>
+          <w:sz w:val="24"/>
+          <w:szCs w:val="24"/>
+          <w:lang w:val="fr-CH"/>
+        </w:rPr>
+        <w:t xml:space="preserve">On a ici un hash généré pour admin </w:t>
+      </w:r>
+      <w:proofErr w:type="spellStart"/>
+      <w:r>
+        <w:rPr>
+          <w:rFonts w:asciiTheme="majorHAnsi" w:hAnsiTheme="majorHAnsi" w:cstheme="majorHAnsi"/>
+          <w:sz w:val="24"/>
+          <w:szCs w:val="24"/>
+          <w:lang w:val="fr-CH"/>
+        </w:rPr>
+        <w:t>alice</w:t>
+      </w:r>
+      <w:proofErr w:type="spellEnd"/>
+      <w:r>
+        <w:rPr>
+          <w:rFonts w:asciiTheme="majorHAnsi" w:hAnsiTheme="majorHAnsi" w:cstheme="majorHAnsi"/>
+          <w:sz w:val="24"/>
+          <w:szCs w:val="24"/>
+          <w:lang w:val="fr-CH"/>
+        </w:rPr>
+        <w:t xml:space="preserve"> qui est dans le </w:t>
+      </w:r>
+      <w:proofErr w:type="spellStart"/>
+      <w:r>
+        <w:rPr>
+          <w:rFonts w:asciiTheme="majorHAnsi" w:hAnsiTheme="majorHAnsi" w:cstheme="majorHAnsi"/>
+          <w:sz w:val="24"/>
+          <w:szCs w:val="24"/>
+          <w:lang w:val="fr-CH"/>
+        </w:rPr>
+        <w:t>db</w:t>
+      </w:r>
+      <w:proofErr w:type="spellEnd"/>
+      <w:r>
+        <w:rPr>
+          <w:rFonts w:asciiTheme="majorHAnsi" w:hAnsiTheme="majorHAnsi" w:cstheme="majorHAnsi"/>
+          <w:sz w:val="24"/>
+          <w:szCs w:val="24"/>
+          <w:lang w:val="fr-CH"/>
+        </w:rPr>
+        <w:t>/</w:t>
+      </w:r>
+      <w:proofErr w:type="spellStart"/>
+      <w:r>
+        <w:rPr>
+          <w:rFonts w:asciiTheme="majorHAnsi" w:hAnsiTheme="majorHAnsi" w:cstheme="majorHAnsi"/>
+          <w:sz w:val="24"/>
+          <w:szCs w:val="24"/>
+          <w:lang w:val="fr-CH"/>
+        </w:rPr>
+        <w:t>init.sql</w:t>
+      </w:r>
+      <w:proofErr w:type="spellEnd"/>
+    </w:p>
+    <w:p>
+      <w:pPr>
+        <w:spacing w:before="0" w:after="0" w:line="240" w:lineRule="auto"/>
+        <w:jc w:val="both"/>
+        <w:rPr>
+          <w:rFonts w:asciiTheme="majorHAnsi" w:hAnsiTheme="majorHAnsi" w:cstheme="majorHAnsi"/>
+          <w:sz w:val="24"/>
+          <w:szCs w:val="24"/>
+          <w:lang w:val="fr-CH"/>
+        </w:rPr>
+      </w:pPr>
     </w:p>
     <w:p>
       <w:pPr>
@@ -2390,7 +2462,6 @@
         <w:rPr>
           <w:lang w:val="fr-CH"/>
         </w:rPr>
-        <w:lastRenderedPageBreak/>
         <w:t>Critique constructiv</w:t>
       </w:r>
       <w:r>
@@ -16192,11 +16263,11 @@
   <w:rsids>
     <w:rsidRoot w:val="001964C1"/>
     <w:rsid w:val="001964C1"/>
-    <w:rsid w:val="001C2EC4"/>
     <w:rsid w:val="002B1A2E"/>
     <w:rsid w:val="00561752"/>
     <w:rsid w:val="0058509A"/>
     <w:rsid w:val="00834C60"/>
+    <w:rsid w:val="008C17B1"/>
     <w:rsid w:val="009B22E2"/>
     <w:rsid w:val="00FD7D0F"/>
   </w:rsids>

</xml_diff>